<commit_message>
Add application screenshots and complete the technical report
</commit_message>
<xml_diff>
--- a/Technical_Report.docx
+++ b/Technical_Report.docx
@@ -531,55 +531,55 @@
         <w:spacing w:after="160"/>
       </w:pPr>
       <w:r>
-        <w:t xml:space="preserve">[Screenshot: Login screen — to be added after manual run]</w:t>
-      </w:r>
-    </w:p>
-    <w:p>
-      <w:pPr>
-        <w:spacing w:after="160"/>
-      </w:pPr>
-      <w:r>
-        <w:t xml:space="preserve">[Screenshot: Dashboard — to be added after manual run]</w:t>
-      </w:r>
-    </w:p>
-    <w:p>
-      <w:pPr>
-        <w:spacing w:after="160"/>
-      </w:pPr>
-      <w:r>
-        <w:t xml:space="preserve">[Screenshot: Rooms screen with add/edit dialog — to be added after manual run]</w:t>
-      </w:r>
-    </w:p>
-    <w:p>
-      <w:pPr>
-        <w:spacing w:after="160"/>
-      </w:pPr>
-      <w:r>
-        <w:t xml:space="preserve">[Screenshot: Reservations screen showing live price quote — to be added after manual run]</w:t>
-      </w:r>
-    </w:p>
-    <w:p>
-      <w:pPr>
-        <w:spacing w:after="160"/>
-      </w:pPr>
-      <w:r>
-        <w:t xml:space="preserve">[Screenshot: Billing screen showing a generated invoice — to be added after manual run]</w:t>
-      </w:r>
-    </w:p>
-    <w:p>
-      <w:pPr>
-        <w:spacing w:after="160"/>
-      </w:pPr>
-      <w:r>
-        <w:t xml:space="preserve">[Screenshot: Guests screen — to be added after manual run]</w:t>
-      </w:r>
-    </w:p>
-    <w:p>
-      <w:pPr>
-        <w:spacing w:after="160"/>
-      </w:pPr>
-      <w:r>
-        <w:t xml:space="preserve">This build was produced in a headless development environment without a display attached, so the application could be compiled and fully unit-tested but not launched interactively to capture screenshots. Screenshots will be added to the screenshots/ folder and this section after running mvn javafx:run on a machine with a display.</w:t>
+        <w:t xml:space="preserve">Login — front-desk sign-in screen (screenshots/login.png)</w:t>
+      </w:r>
+    </w:p>
+    <w:p>
+      <w:pPr>
+        <w:spacing w:after="160"/>
+      </w:pPr>
+      <w:r>
+        <w:t xml:space="preserve">Dashboard — room occupancy summary (8 available, 0 reserved/occupied/maintenance) and today’s check-in/check-out lists (screenshots/dashboard.png)</w:t>
+      </w:r>
+    </w:p>
+    <w:p>
+      <w:pPr>
+        <w:spacing w:after="160"/>
+      </w:pPr>
+      <w:r>
+        <w:t xml:space="preserve">Rooms — the seeded room inventory across all three types (Standard, Deluxe, Suite) with status/type filters and per-room Edit/Toggle Maintenance actions (screenshots/rooms.png)</w:t>
+      </w:r>
+    </w:p>
+    <w:p>
+      <w:pPr>
+        <w:spacing w:after="160"/>
+      </w:pPr>
+      <w:r>
+        <w:t xml:space="preserve">Guests — guest table with name search and Add Guest action (screenshots/guests.png)</w:t>
+      </w:r>
+    </w:p>
+    <w:p>
+      <w:pPr>
+        <w:spacing w:after="160"/>
+      </w:pPr>
+      <w:r>
+        <w:t xml:space="preserve">Reservations — the booking form (guest, room, check-in/check-out dates, guest count, live price quote) above the reservations table with check-in/check-out/cancel actions (screenshots/reservations.png)</w:t>
+      </w:r>
+    </w:p>
+    <w:p>
+      <w:pPr>
+        <w:spacing w:after="160"/>
+      </w:pPr>
+      <w:r>
+        <w:t xml:space="preserve">Billing — reservation selector, generated itemized invoice panel, and the payment recording form (method + amount) (screenshots/billing.png)</w:t>
+      </w:r>
+    </w:p>
+    <w:p>
+      <w:pPr>
+        <w:spacing w:after="160"/>
+      </w:pPr>
+      <w:r>
+        <w:t xml:space="preserve">These were captured by running mvn javafx:run locally on a Windows machine with a display, signing in with the front-desk credentials, and walking through each screen.</w:t>
       </w:r>
     </w:p>
     <w:p>

</xml_diff>

<commit_message>
Fix GitHub link in technical report to a real external hyperlink
</commit_message>
<xml_diff>
--- a/Technical_Report.docx
+++ b/Technical_Report.docx
@@ -181,8 +181,18 @@
           <w:sz w:val="24"/>
           <w:szCs w:val="24"/>
         </w:rPr>
-        <w:t xml:space="preserve">GitHub Repository: github.com/myciscomap-prog/hotel-reservation-management-system</w:t>
-      </w:r>
+        <w:t xml:space="preserve">GitHub Repository: </w:t>
+      </w:r>
+      <w:hyperlink r:id="rId7" w:history="1">
+        <w:r>
+          <w:rPr>
+            <w:rStyle w:val="Hyperlink"/>
+            <w:sz w:val="24"/>
+            <w:szCs w:val="24"/>
+          </w:rPr>
+          <w:t>https://github.com/myciscomap-prog/hotel-reservation-management-system</w:t>
+        </w:r>
+      </w:hyperlink>
     </w:p>
     <w:p>
       <w:pPr>
@@ -1830,9 +1840,14 @@
       <w:pPr>
         <w:spacing w:after="160"/>
       </w:pPr>
-      <w:r>
-        <w:t>https://github.com/myciscomap-prog/hotel-reservation-management-system</w:t>
-      </w:r>
+      <w:hyperlink r:id="rId7" w:history="1">
+        <w:r>
+          <w:rPr>
+            <w:rStyle w:val="Hyperlink"/>
+          </w:rPr>
+          <w:t>https://github.com/myciscomap-prog/hotel-reservation-management-system</w:t>
+        </w:r>
+      </w:hyperlink>
     </w:p>
     <w:p>
       <w:pPr>

</xml_diff>

<commit_message>
Update technical report (re-saved after link verification in Word)
</commit_message>
<xml_diff>
--- a/Technical_Report.docx
+++ b/Technical_Report.docx
@@ -19,7 +19,7 @@
           <w:sz w:val="28"/>
           <w:szCs w:val="28"/>
         </w:rPr>
-        <w:t xml:space="preserve">UNIVERSITY OF CAPE COAST</w:t>
+        <w:t>UNIVERSITY OF CAPE COAST</w:t>
       </w:r>
     </w:p>
     <w:p>
@@ -34,7 +34,7 @@
           <w:sz w:val="24"/>
           <w:szCs w:val="24"/>
         </w:rPr>
-        <w:t xml:space="preserve">COLLEGE OF DISTANCE EDUCATION (CoDE)</w:t>
+        <w:t>COLLEGE OF DISTANCE EDUCATION (CoDE)</w:t>
       </w:r>
     </w:p>
     <w:p>
@@ -49,7 +49,7 @@
           <w:sz w:val="24"/>
           <w:szCs w:val="24"/>
         </w:rPr>
-        <w:t xml:space="preserve">DEPARTMENT OF SCIENCE AND MATHEMATICS</w:t>
+        <w:t>DEPARTMENT OF SCIENCE AND MATHEMATICS</w:t>
       </w:r>
     </w:p>
     <w:p>
@@ -64,7 +64,7 @@
           <w:sz w:val="24"/>
           <w:szCs w:val="24"/>
         </w:rPr>
-        <w:t xml:space="preserve">INF811D: OBJECT ORIENTED PROGRAMMING</w:t>
+        <w:t>INF811D: OBJECT ORIENTED PROGRAMMING</w:t>
       </w:r>
     </w:p>
     <w:p>
@@ -79,7 +79,7 @@
           <w:sz w:val="24"/>
           <w:szCs w:val="24"/>
         </w:rPr>
-        <w:t xml:space="preserve">MSc INFORMATION TECHNOLOGY PROGRAMME</w:t>
+        <w:t>MSc INFORMATION TECHNOLOGY PROGRAMME</w:t>
       </w:r>
     </w:p>
     <w:p>
@@ -94,7 +94,7 @@
           <w:sz w:val="32"/>
           <w:szCs w:val="32"/>
         </w:rPr>
-        <w:t xml:space="preserve">Technical Report</w:t>
+        <w:t>Technical Report</w:t>
       </w:r>
     </w:p>
     <w:p>
@@ -109,7 +109,7 @@
           <w:sz w:val="40"/>
           <w:szCs w:val="40"/>
         </w:rPr>
-        <w:t xml:space="preserve">Hotel Reservation Management System</w:t>
+        <w:t>Hotel Reservation Management System</w:t>
       </w:r>
     </w:p>
     <w:p>
@@ -124,7 +124,7 @@
           <w:sz w:val="24"/>
           <w:szCs w:val="24"/>
         </w:rPr>
-        <w:t xml:space="preserve">A JavaFX Desktop Application for Front-Desk Room, Guest, Reservation, and Billing Management</w:t>
+        <w:t>A JavaFX Desktop Application for Front-Desk Room, Guest, Reservation, and Billing Management</w:t>
       </w:r>
     </w:p>
     <w:p>
@@ -142,33 +142,47 @@
           <w:sz w:val="24"/>
           <w:szCs w:val="24"/>
         </w:rPr>
-        <w:t xml:space="preserve">Technical Report — Semester 1 Practical Project, 2025/2026 Academic Year</w:t>
-      </w:r>
-    </w:p>
-    <w:p>
-      <w:pPr>
-        <w:spacing w:after="120"/>
-        <w:jc w:val="center"/>
-      </w:pPr>
+        <w:t xml:space="preserve">Technical Report </w:t>
+      </w:r>
       <w:r>
         <w:rPr>
           <w:sz w:val="24"/>
           <w:szCs w:val="24"/>
         </w:rPr>
-        <w:t xml:space="preserve">Submitted by: Michael Quarshie</w:t>
-      </w:r>
-    </w:p>
-    <w:p>
-      <w:pPr>
-        <w:spacing w:after="120"/>
-        <w:jc w:val="center"/>
-      </w:pPr>
+        <w:t>-</w:t>
+      </w:r>
       <w:r>
         <w:rPr>
           <w:sz w:val="24"/>
           <w:szCs w:val="24"/>
         </w:rPr>
-        <w:t xml:space="preserve">Index Number: MS/ITE/25/0012</w:t>
+        <w:t xml:space="preserve"> Semester 1 Practical Project, 2025/2026 Academic Year</w:t>
+      </w:r>
+    </w:p>
+    <w:p>
+      <w:pPr>
+        <w:spacing w:after="120"/>
+        <w:jc w:val="center"/>
+      </w:pPr>
+      <w:r>
+        <w:rPr>
+          <w:sz w:val="24"/>
+          <w:szCs w:val="24"/>
+        </w:rPr>
+        <w:t>Submitted by: Michael Quarshie</w:t>
+      </w:r>
+    </w:p>
+    <w:p>
+      <w:pPr>
+        <w:spacing w:after="120"/>
+        <w:jc w:val="center"/>
+      </w:pPr>
+      <w:r>
+        <w:rPr>
+          <w:sz w:val="24"/>
+          <w:szCs w:val="24"/>
+        </w:rPr>
+        <w:t>Index Number: MS/ITE/25/0012</w:t>
       </w:r>
     </w:p>
     <w:p>
@@ -183,7 +197,7 @@
         </w:rPr>
         <w:t xml:space="preserve">GitHub Repository: </w:t>
       </w:r>
-      <w:hyperlink r:id="rId7" w:history="1">
+      <w:hyperlink r:id="rId5" w:history="1">
         <w:r>
           <w:rPr>
             <w:rStyle w:val="Hyperlink"/>
@@ -204,7 +218,7 @@
           <w:sz w:val="24"/>
           <w:szCs w:val="24"/>
         </w:rPr>
-        <w:t xml:space="preserve">Date: July 2026</w:t>
+        <w:t>Date: July 2026</w:t>
       </w:r>
     </w:p>
     <w:p>
@@ -1840,7 +1854,7 @@
       <w:pPr>
         <w:spacing w:after="160"/>
       </w:pPr>
-      <w:hyperlink r:id="rId7" w:history="1">
+      <w:hyperlink r:id="rId6" w:history="1">
         <w:r>
           <w:rPr>
             <w:rStyle w:val="Hyperlink"/>
@@ -2267,12 +2281,6 @@
         <w:gridCol w:w="6800"/>
       </w:tblGrid>
       <w:tr>
-        <w:tblPrEx>
-          <w:tblCellMar>
-            <w:top w:w="0" w:type="dxa"/>
-            <w:bottom w:w="0" w:type="dxa"/>
-          </w:tblCellMar>
-        </w:tblPrEx>
         <w:trPr>
           <w:tblHeader/>
         </w:trPr>
@@ -2310,12 +2318,6 @@
         </w:tc>
       </w:tr>
       <w:tr>
-        <w:tblPrEx>
-          <w:tblCellMar>
-            <w:top w:w="0" w:type="dxa"/>
-            <w:bottom w:w="0" w:type="dxa"/>
-          </w:tblCellMar>
-        </w:tblPrEx>
         <w:tc>
           <w:tcPr>
             <w:tcW w:w="2200" w:type="dxa"/>
@@ -2338,12 +2340,6 @@
         </w:tc>
       </w:tr>
       <w:tr>
-        <w:tblPrEx>
-          <w:tblCellMar>
-            <w:top w:w="0" w:type="dxa"/>
-            <w:bottom w:w="0" w:type="dxa"/>
-          </w:tblCellMar>
-        </w:tblPrEx>
         <w:tc>
           <w:tcPr>
             <w:tcW w:w="2200" w:type="dxa"/>
@@ -2387,12 +2383,6 @@
         </w:tc>
       </w:tr>
       <w:tr>
-        <w:tblPrEx>
-          <w:tblCellMar>
-            <w:top w:w="0" w:type="dxa"/>
-            <w:bottom w:w="0" w:type="dxa"/>
-          </w:tblCellMar>
-        </w:tblPrEx>
         <w:tc>
           <w:tcPr>
             <w:tcW w:w="2200" w:type="dxa"/>
@@ -2428,12 +2418,6 @@
         </w:tc>
       </w:tr>
       <w:tr>
-        <w:tblPrEx>
-          <w:tblCellMar>
-            <w:top w:w="0" w:type="dxa"/>
-            <w:bottom w:w="0" w:type="dxa"/>
-          </w:tblCellMar>
-        </w:tblPrEx>
         <w:tc>
           <w:tcPr>
             <w:tcW w:w="2200" w:type="dxa"/>
@@ -2456,12 +2440,6 @@
         </w:tc>
       </w:tr>
       <w:tr>
-        <w:tblPrEx>
-          <w:tblCellMar>
-            <w:top w:w="0" w:type="dxa"/>
-            <w:bottom w:w="0" w:type="dxa"/>
-          </w:tblCellMar>
-        </w:tblPrEx>
         <w:tc>
           <w:tcPr>
             <w:tcW w:w="2200" w:type="dxa"/>
@@ -2508,12 +2486,6 @@
         </w:tc>
       </w:tr>
       <w:tr>
-        <w:tblPrEx>
-          <w:tblCellMar>
-            <w:top w:w="0" w:type="dxa"/>
-            <w:bottom w:w="0" w:type="dxa"/>
-          </w:tblCellMar>
-        </w:tblPrEx>
         <w:tc>
           <w:tcPr>
             <w:tcW w:w="2200" w:type="dxa"/>
@@ -2578,12 +2550,6 @@
         </w:tc>
       </w:tr>
       <w:tr>
-        <w:tblPrEx>
-          <w:tblCellMar>
-            <w:top w:w="0" w:type="dxa"/>
-            <w:bottom w:w="0" w:type="dxa"/>
-          </w:tblCellMar>
-        </w:tblPrEx>
         <w:tc>
           <w:tcPr>
             <w:tcW w:w="2200" w:type="dxa"/>
@@ -3496,6 +3462,18 @@
       <w:szCs w:val="20"/>
     </w:rPr>
   </w:style>
+  <w:style w:type="character" w:styleId="FollowedHyperlink">
+    <w:name w:val="FollowedHyperlink"/>
+    <w:basedOn w:val="DefaultParagraphFont"/>
+    <w:uiPriority w:val="99"/>
+    <w:semiHidden/>
+    <w:unhideWhenUsed/>
+    <w:rsid w:val="00DF3EBE"/>
+    <w:rPr>
+      <w:color w:val="96607D" w:themeColor="followedHyperlink"/>
+      <w:u w:val="single"/>
+    </w:rPr>
+  </w:style>
 </w:styles>
 </file>
 

</xml_diff>